<commit_message>
Deploying to gh-pages from @ d-morrison/wai@f28a19465d4eebac9e59c97d098bebbe3ca8cc4b 🚀
</commit_message>
<xml_diff>
--- a/index.docx
+++ b/index.docx
@@ -7,7 +7,7 @@
         <w:pStyle w:val="Title"/>
       </w:pPr>
       <w:r>
-        <w:t xml:space="preserve">Quarto Website Template</w:t>
+        <w:t xml:space="preserve">Working with AI</w:t>
       </w:r>
     </w:p>
     <w:p>
@@ -15,16 +15,7 @@
         <w:pStyle w:val="Date"/>
       </w:pPr>
       <w:r>
-        <w:t xml:space="preserve">Last modified: 2026-07-14 12:09:22 (PDT)</w:t>
-      </w:r>
-    </w:p>
-    <w:bookmarkStart w:id="17" w:name="welcome"/>
-    <w:p>
-      <w:pPr>
-        <w:pStyle w:val="Heading1"/>
-      </w:pPr>
-      <w:r>
-        <w:t xml:space="preserve">Welcome</w:t>
+        <w:t xml:space="preserve">Last modified: 2026-07-15 23:18:00 (PDT)</w:t>
       </w:r>
     </w:p>
     <w:p>
@@ -32,15 +23,218 @@
         <w:pStyle w:val="FirstParagraph"/>
       </w:pPr>
       <w:r>
-        <w:t xml:space="preserve">This is a Quarto website template that you can use to create your own website.</w:t>
-      </w:r>
-    </w:p>
-    <w:p>
-      <w:pPr>
-        <w:pStyle w:val="BodyText"/>
-      </w:pPr>
-      <w:r>
-        <w:t xml:space="preserve">The notes are available in multiple formats:</w:t>
+        <w:t xml:space="preserve">This site collects the UCD-SERG lab’s notes on working responsibly and</w:t>
+      </w:r>
+      <w:r>
+        <w:t xml:space="preserve"> </w:t>
+      </w:r>
+      <w:r>
+        <w:t xml:space="preserve">effectively with AI coding assistants: what they are, how to use them, and</w:t>
+      </w:r>
+      <w:r>
+        <w:t xml:space="preserve"> </w:t>
+      </w:r>
+      <w:r>
+        <w:t xml:space="preserve">the policies lab members follow when using them.</w:t>
+      </w:r>
+      <w:r>
+        <w:t xml:space="preserve"> </w:t>
+      </w:r>
+      <w:r>
+        <w:t xml:space="preserve">It was migrated out of the</w:t>
+      </w:r>
+      <w:r>
+        <w:t xml:space="preserve"> </w:t>
+      </w:r>
+      <w:hyperlink r:id="rId9">
+        <w:r>
+          <w:rPr>
+            <w:rStyle w:val="Hyperlink"/>
+          </w:rPr>
+          <w:t xml:space="preserve">UCD-SERG Lab Manual</w:t>
+        </w:r>
+      </w:hyperlink>
+      <w:r>
+        <w:t xml:space="preserve">’s</w:t>
+      </w:r>
+      <w:r>
+        <w:t xml:space="preserve"> </w:t>
+      </w:r>
+      <w:r>
+        <w:t xml:space="preserve">“Working with</w:t>
+      </w:r>
+      <w:r>
+        <w:t xml:space="preserve"> </w:t>
+      </w:r>
+      <w:r>
+        <w:t xml:space="preserve">AI”</w:t>
+      </w:r>
+      <w:r>
+        <w:t xml:space="preserve"> </w:t>
+      </w:r>
+      <w:r>
+        <w:t xml:space="preserve">chapter, which had grown large enough to deserve a dedicated site.</w:t>
+      </w:r>
+      <w:r>
+        <w:t xml:space="preserve"> </w:t>
+      </w:r>
+      <w:r>
+        <w:t xml:space="preserve">For the lab’s broader coding, reproducibility, and collaboration</w:t>
+      </w:r>
+      <w:r>
+        <w:t xml:space="preserve"> </w:t>
+      </w:r>
+      <w:r>
+        <w:t xml:space="preserve">conventions, see the lab manual itself.</w:t>
+      </w:r>
+    </w:p>
+    <w:tbl>
+      <w:tblPr>
+        <w:tblStyle w:val="Table"/>
+        <w:tblLook w:firstRow="0" w:lastRow="0" w:firstColumn="0" w:lastColumn="0" w:noHBand="0" w:noVBand="0" w:val="0000"/>
+        <w:tblBorders>
+          <w:top w:val="single" w:sz="4" w:space="0" w:color="EB9113"/>
+          <w:left w:val="single" w:sz="24" w:space="0" w:color="EB9113"/>
+          <w:bottom w:val="single" w:sz="4" w:space="0" w:color="EB9113"/>
+          <w:right w:val="single" w:sz="4" w:space="0" w:color="EB9113"/>
+        </w:tblBorders>
+        <w:tblCellMar>
+          <w:left w:w="144" w:type="dxa"/>
+          <w:right w:w="144" w:type="dxa"/>
+        </w:tblCellMar>
+        <w:tblLook w:firstRow="0" w:lastRow="0" w:firstColumn="0" w:lastColumn="0" w:noHBand="0" w:noVBand="0" w:val="0000"/>
+      </w:tblPr>
+      <w:tr>
+        <w:trPr>
+          <w:cantSplit/>
+        </w:trPr>
+        <w:tc>
+          <w:tcPr>
+            <w:shd w:color="auto" w:fill="fcefdc" w:val="clear"/>
+            <w:tcMar>
+              <w:top w:w="92" w:type="dxa"/>
+              <w:bottom w:w="92" w:type="dxa"/>
+            </w:tcMar>
+          </w:tcPr>
+          <w:p>
+            <w:pPr>
+              <w:pStyle w:val="BodyText"/>
+            </w:pPr>
+            <w:pPr>
+              <w:spacing w:before="0" w:after="0"/>
+              <w:textAlignment w:val="center"/>
+            </w:pPr>
+            <w:r>
+              <w:drawing>
+                <wp:inline>
+                  <wp:extent cx="152400" cy="152400"/>
+                  <wp:effectExtent b="0" l="0" r="0" t="0"/>
+                  <wp:docPr descr="" title="" id="11" name="Picture"/>
+                  <a:graphic>
+                    <a:graphicData uri="http://schemas.openxmlformats.org/drawingml/2006/picture">
+                      <pic:pic>
+                        <pic:nvPicPr>
+                          <pic:cNvPr descr="/opt/quarto/share/formats/docx/warning.png" id="12" name="Picture"/>
+                          <pic:cNvPicPr>
+                            <a:picLocks noChangeArrowheads="1" noChangeAspect="1"/>
+                          </pic:cNvPicPr>
+                        </pic:nvPicPr>
+                        <pic:blipFill>
+                          <a:blip r:embed="rId10"/>
+                          <a:stretch>
+                            <a:fillRect/>
+                          </a:stretch>
+                        </pic:blipFill>
+                        <pic:spPr bwMode="auto">
+                          <a:xfrm>
+                            <a:off x="0" y="0"/>
+                            <a:ext cx="152400" cy="152400"/>
+                          </a:xfrm>
+                          <a:prstGeom prst="rect">
+                            <a:avLst/>
+                          </a:prstGeom>
+                          <a:noFill/>
+                          <a:ln w="9525">
+                            <a:noFill/>
+                            <a:headEnd/>
+                            <a:tailEnd/>
+                          </a:ln>
+                        </pic:spPr>
+                      </pic:pic>
+                    </a:graphicData>
+                  </a:graphic>
+                </wp:inline>
+              </w:drawing>
+            </w:r>
+            <w:r>
+              <w:t xml:space="preserve"> </w:t>
+            </w:r>
+            <w:r>
+              <w:t xml:space="preserve"> </w:t>
+            </w:r>
+            <w:r>
+              <w:t xml:space="preserve">Technology in Rapid Evolution</w:t>
+            </w:r>
+          </w:p>
+        </w:tc>
+      </w:tr>
+      <w:tr>
+        <w:trPr>
+          <w:cantSplit/>
+        </w:trPr>
+        <w:tc>
+          <w:tcPr>
+            <w:tcMar>
+              <w:top w:w="108" w:type="dxa"/>
+              <w:bottom w:w="108" w:type="dxa"/>
+            </w:tcMar>
+          </w:tcPr>
+          <w:p>
+            <w:pPr>
+              <w:pStyle w:val="BodyText"/>
+            </w:pPr>
+            <w:pPr>
+              <w:spacing w:before="16" w:after="16"/>
+            </w:pPr>
+            <w:r>
+              <w:t xml:space="preserve">As of early 2026,</w:t>
+            </w:r>
+            <w:r>
+              <w:t xml:space="preserve"> </w:t>
+            </w:r>
+            <w:r>
+              <w:t xml:space="preserve">AI coding assistant technology is changing extremely rapidly,</w:t>
+            </w:r>
+            <w:r>
+              <w:t xml:space="preserve"> </w:t>
+            </w:r>
+            <w:r>
+              <w:t xml:space="preserve">and we are just beginning to figure out how to use these tools effectively ourselves.</w:t>
+            </w:r>
+            <w:r>
+              <w:t xml:space="preserve"> </w:t>
+            </w:r>
+            <w:r>
+              <w:t xml:space="preserve">All information on this site should be taken with extra caution,</w:t>
+            </w:r>
+            <w:r>
+              <w:t xml:space="preserve"> </w:t>
+            </w:r>
+            <w:r>
+              <w:t xml:space="preserve">as best practices and capabilities continue to evolve.</w:t>
+            </w:r>
+          </w:p>
+          <w:p/>
+        </w:tc>
+      </w:tr>
+    </w:tbl>
+    <w:bookmarkStart w:id="16" w:name="chapters"/>
+    <w:p>
+      <w:pPr>
+        <w:pStyle w:val="Heading2"/>
+      </w:pPr>
+      <w:r>
+        <w:t xml:space="preserve">1 Chapters</w:t>
       </w:r>
     </w:p>
     <w:p>
@@ -51,6 +245,122 @@
           <w:numId w:val="1001"/>
         </w:numPr>
       </w:pPr>
+      <w:hyperlink r:id="rId13">
+        <w:r>
+          <w:rPr>
+            <w:rStyle w:val="Hyperlink"/>
+            <w:b/>
+            <w:bCs/>
+          </w:rPr>
+          <w:t xml:space="preserve">Policies for Using AI</w:t>
+        </w:r>
+      </w:hyperlink>
+      <w:r>
+        <w:t xml:space="preserve">:</w:t>
+      </w:r>
+      <w:r>
+        <w:t xml:space="preserve"> </w:t>
+      </w:r>
+      <w:r>
+        <w:t xml:space="preserve">responsibility for validation, disclosure, attribution, and using AI for</w:t>
+      </w:r>
+      <w:r>
+        <w:t xml:space="preserve"> </w:t>
+      </w:r>
+      <w:r>
+        <w:t xml:space="preserve">journal articles</w:t>
+      </w:r>
+    </w:p>
+    <w:p>
+      <w:pPr>
+        <w:pStyle w:val="Compact"/>
+        <w:numPr>
+          <w:ilvl w:val="0"/>
+          <w:numId w:val="1001"/>
+        </w:numPr>
+      </w:pPr>
+      <w:hyperlink r:id="rId14">
+        <w:r>
+          <w:rPr>
+            <w:rStyle w:val="Hyperlink"/>
+            <w:b/>
+            <w:bCs/>
+          </w:rPr>
+          <w:t xml:space="preserve">Coding Agents</w:t>
+        </w:r>
+      </w:hyperlink>
+      <w:r>
+        <w:t xml:space="preserve">:</w:t>
+      </w:r>
+      <w:r>
+        <w:t xml:space="preserve"> </w:t>
+      </w:r>
+      <w:r>
+        <w:t xml:space="preserve">what language models, coding agents, and harnesses are; how to work with</w:t>
+      </w:r>
+      <w:r>
+        <w:t xml:space="preserve"> </w:t>
+      </w:r>
+      <w:r>
+        <w:t xml:space="preserve">them; benefits, hazards, and best practices; and configuring your</w:t>
+      </w:r>
+      <w:r>
+        <w:t xml:space="preserve"> </w:t>
+      </w:r>
+      <w:r>
+        <w:t xml:space="preserve">environment</w:t>
+      </w:r>
+    </w:p>
+    <w:p>
+      <w:pPr>
+        <w:pStyle w:val="Compact"/>
+        <w:numPr>
+          <w:ilvl w:val="0"/>
+          <w:numId w:val="1001"/>
+        </w:numPr>
+      </w:pPr>
+      <w:hyperlink r:id="rId15">
+        <w:r>
+          <w:rPr>
+            <w:rStyle w:val="Hyperlink"/>
+            <w:b/>
+            <w:bCs/>
+          </w:rPr>
+          <w:t xml:space="preserve">Pull-Request Workflow with Agents</w:t>
+        </w:r>
+      </w:hyperlink>
+      <w:r>
+        <w:t xml:space="preserve">:</w:t>
+      </w:r>
+      <w:r>
+        <w:t xml:space="preserve"> </w:t>
+      </w:r>
+      <w:r>
+        <w:t xml:space="preserve">filing issues, claiming work, and driving a pull request to a clean,</w:t>
+      </w:r>
+      <w:r>
+        <w:t xml:space="preserve"> </w:t>
+      </w:r>
+      <w:r>
+        <w:t xml:space="preserve">mergeable state</w:t>
+      </w:r>
+    </w:p>
+    <w:p>
+      <w:pPr>
+        <w:pStyle w:val="FirstParagraph"/>
+      </w:pPr>
+      <w:r>
+        <w:t xml:space="preserve">The notes are available in multiple formats:</w:t>
+      </w:r>
+    </w:p>
+    <w:p>
+      <w:pPr>
+        <w:pStyle w:val="Compact"/>
+        <w:numPr>
+          <w:ilvl w:val="0"/>
+          <w:numId w:val="1002"/>
+        </w:numPr>
+      </w:pPr>
       <w:r>
         <w:rPr>
           <w:b/>
@@ -67,7 +377,7 @@
         <w:pStyle w:val="Compact"/>
         <w:numPr>
           <w:ilvl w:val="0"/>
-          <w:numId w:val="1001"/>
+          <w:numId w:val="1002"/>
         </w:numPr>
       </w:pPr>
       <w:r>
@@ -101,7 +411,7 @@
         <w:pStyle w:val="Compact"/>
         <w:numPr>
           <w:ilvl w:val="0"/>
-          <w:numId w:val="1001"/>
+          <w:numId w:val="1002"/>
         </w:numPr>
       </w:pPr>
       <w:r>
@@ -135,7 +445,7 @@
         <w:pStyle w:val="Compact"/>
         <w:numPr>
           <w:ilvl w:val="0"/>
-          <w:numId w:val="1001"/>
+          <w:numId w:val="1002"/>
         </w:numPr>
       </w:pPr>
       <w:r>
@@ -164,13 +474,14 @@
         <w:t xml:space="preserve">extension</w:t>
       </w:r>
     </w:p>
-    <w:bookmarkStart w:id="10" w:name="about-this-website"/>
+    <w:bookmarkEnd w:id="16"/>
+    <w:bookmarkStart w:id="19" w:name="about-this-website"/>
     <w:p>
       <w:pPr>
         <w:pStyle w:val="Heading2"/>
       </w:pPr>
       <w:r>
-        <w:t xml:space="preserve">0.1 About this website</w:t>
+        <w:t xml:space="preserve">2 About this website</w:t>
       </w:r>
     </w:p>
     <w:p>
@@ -183,7 +494,7 @@
       <w:r>
         <w:t xml:space="preserve"> </w:t>
       </w:r>
-      <w:hyperlink r:id="rId9">
+      <w:hyperlink r:id="rId17">
         <w:r>
           <w:rPr>
             <w:rStyle w:val="Hyperlink"/>
@@ -192,179 +503,55 @@
         </w:r>
       </w:hyperlink>
       <w:r>
-        <w:t xml:space="preserve">, an open-source scientific and technical publishing system. You can use Quarto to create books, websites, blogs, presentations, and more from markdown files.</w:t>
-      </w:r>
-    </w:p>
-    <w:bookmarkEnd w:id="10"/>
-    <w:bookmarkStart w:id="11" w:name="getting-started"/>
+        <w:t xml:space="preserve">, an open-source scientific and technical publishing system, from the</w:t>
+      </w:r>
+      <w:r>
+        <w:t xml:space="preserve"> </w:t>
+      </w:r>
+      <w:hyperlink r:id="rId18">
+        <w:r>
+          <w:rPr>
+            <w:rStyle w:val="Hyperlink"/>
+          </w:rPr>
+          <w:t xml:space="preserve">UCD-SERG</w:t>
+        </w:r>
+        <w:r>
+          <w:rPr>
+            <w:rStyle w:val="Hyperlink"/>
+          </w:rPr>
+          <w:t xml:space="preserve"> </w:t>
+        </w:r>
+        <w:r>
+          <w:rPr>
+            <w:rStyle w:val="VerbatimChar"/>
+          </w:rPr>
+          <w:t xml:space="preserve">qwt</w:t>
+        </w:r>
+        <w:r>
+          <w:rPr>
+            <w:rStyle w:val="Hyperlink"/>
+          </w:rPr>
+          <w:t xml:space="preserve"> </w:t>
+        </w:r>
+        <w:r>
+          <w:rPr>
+            <w:rStyle w:val="Hyperlink"/>
+          </w:rPr>
+          <w:t xml:space="preserve">(Quarto Website Template)</w:t>
+        </w:r>
+      </w:hyperlink>
+      <w:r>
+        <w:t xml:space="preserve">.</w:t>
+      </w:r>
+    </w:p>
+    <w:bookmarkEnd w:id="19"/>
+    <w:bookmarkStart w:id="20" w:name="building-the-website"/>
     <w:p>
       <w:pPr>
         <w:pStyle w:val="Heading2"/>
       </w:pPr>
       <w:r>
-        <w:t xml:space="preserve">0.2 Getting Started</w:t>
-      </w:r>
-    </w:p>
-    <w:p>
-      <w:pPr>
-        <w:pStyle w:val="FirstParagraph"/>
-      </w:pPr>
-      <w:r>
-        <w:t xml:space="preserve">To use this template:</w:t>
-      </w:r>
-    </w:p>
-    <w:p>
-      <w:pPr>
-        <w:numPr>
-          <w:ilvl w:val="0"/>
-          <w:numId w:val="1002"/>
-        </w:numPr>
-      </w:pPr>
-      <w:r>
-        <w:rPr>
-          <w:b/>
-          <w:bCs/>
-        </w:rPr>
-        <w:t xml:space="preserve">Update the configuration</w:t>
-      </w:r>
-      <w:r>
-        <w:t xml:space="preserve">: Edit</w:t>
-      </w:r>
-      <w:r>
-        <w:t xml:space="preserve"> </w:t>
-      </w:r>
-      <w:r>
-        <w:rPr>
-          <w:rStyle w:val="VerbatimChar"/>
-        </w:rPr>
-        <w:t xml:space="preserve">_quarto-website.yml</w:t>
-      </w:r>
-      <w:r>
-        <w:t xml:space="preserve"> </w:t>
-      </w:r>
-      <w:r>
-        <w:t xml:space="preserve">to change the website title, site URL, and navigation menu.</w:t>
-      </w:r>
-    </w:p>
-    <w:p>
-      <w:pPr>
-        <w:numPr>
-          <w:ilvl w:val="0"/>
-          <w:numId w:val="1002"/>
-        </w:numPr>
-      </w:pPr>
-      <w:r>
-        <w:rPr>
-          <w:b/>
-          <w:bCs/>
-        </w:rPr>
-        <w:t xml:space="preserve">Add your content</w:t>
-      </w:r>
-      <w:r>
-        <w:t xml:space="preserve">: Create new</w:t>
-      </w:r>
-      <w:r>
-        <w:t xml:space="preserve"> </w:t>
-      </w:r>
-      <w:r>
-        <w:rPr>
-          <w:rStyle w:val="VerbatimChar"/>
-        </w:rPr>
-        <w:t xml:space="preserve">.qmd</w:t>
-      </w:r>
-      <w:r>
-        <w:t xml:space="preserve"> </w:t>
-      </w:r>
-      <w:r>
-        <w:t xml:space="preserve">files for each page and add them to the navigation menu in</w:t>
-      </w:r>
-      <w:r>
-        <w:t xml:space="preserve"> </w:t>
-      </w:r>
-      <w:r>
-        <w:rPr>
-          <w:rStyle w:val="VerbatimChar"/>
-        </w:rPr>
-        <w:t xml:space="preserve">_quarto-website.yml</w:t>
-      </w:r>
-      <w:r>
-        <w:t xml:space="preserve">.</w:t>
-      </w:r>
-    </w:p>
-    <w:p>
-      <w:pPr>
-        <w:numPr>
-          <w:ilvl w:val="0"/>
-          <w:numId w:val="1002"/>
-        </w:numPr>
-      </w:pPr>
-      <w:r>
-        <w:rPr>
-          <w:b/>
-          <w:bCs/>
-        </w:rPr>
-        <w:t xml:space="preserve">Customize the style</w:t>
-      </w:r>
-      <w:r>
-        <w:t xml:space="preserve">: Modify</w:t>
-      </w:r>
-      <w:r>
-        <w:t xml:space="preserve"> </w:t>
-      </w:r>
-      <w:r>
-        <w:rPr>
-          <w:rStyle w:val="VerbatimChar"/>
-        </w:rPr>
-        <w:t xml:space="preserve">styles.css</w:t>
-      </w:r>
-      <w:r>
-        <w:t xml:space="preserve"> </w:t>
-      </w:r>
-      <w:r>
-        <w:t xml:space="preserve">to change the appearance of your website.</w:t>
-      </w:r>
-    </w:p>
-    <w:p>
-      <w:pPr>
-        <w:numPr>
-          <w:ilvl w:val="0"/>
-          <w:numId w:val="1002"/>
-        </w:numPr>
-      </w:pPr>
-      <w:r>
-        <w:rPr>
-          <w:b/>
-          <w:bCs/>
-        </w:rPr>
-        <w:t xml:space="preserve">Add references</w:t>
-      </w:r>
-      <w:r>
-        <w:t xml:space="preserve">: Update</w:t>
-      </w:r>
-      <w:r>
-        <w:t xml:space="preserve"> </w:t>
-      </w:r>
-      <w:r>
-        <w:rPr>
-          <w:rStyle w:val="VerbatimChar"/>
-        </w:rPr>
-        <w:t xml:space="preserve">references.bib</w:t>
-      </w:r>
-      <w:r>
-        <w:t xml:space="preserve"> </w:t>
-      </w:r>
-      <w:r>
-        <w:t xml:space="preserve">with your citations.</w:t>
-      </w:r>
-    </w:p>
-    <w:bookmarkEnd w:id="11"/>
-    <w:bookmarkStart w:id="12" w:name="building-the-website"/>
-    <w:p>
-      <w:pPr>
-        <w:pStyle w:val="Heading2"/>
-      </w:pPr>
-      <w:r>
-        <w:t xml:space="preserve">0.3 Building the website</w:t>
+        <w:t xml:space="preserve">3 Building the website</w:t>
       </w:r>
     </w:p>
     <w:p>
@@ -437,17 +624,17 @@
         <w:t xml:space="preserve"> </w:t>
       </w:r>
       <w:r>
-        <w:t xml:space="preserve">directory, which can be published to GitHub Pages.</w:t>
-      </w:r>
-    </w:p>
-    <w:bookmarkEnd w:id="12"/>
-    <w:bookmarkStart w:id="13" w:name="publishing-to-github-pages"/>
+        <w:t xml:space="preserve">directory, which is published to GitHub Pages.</w:t>
+      </w:r>
+    </w:p>
+    <w:bookmarkEnd w:id="20"/>
+    <w:bookmarkStart w:id="22" w:name="license"/>
     <w:p>
       <w:pPr>
         <w:pStyle w:val="Heading2"/>
       </w:pPr>
       <w:r>
-        <w:t xml:space="preserve">0.4 Publishing to GitHub Pages</w:t>
+        <w:t xml:space="preserve">4 License</w:t>
       </w:r>
     </w:p>
     <w:p>
@@ -455,153 +642,36 @@
         <w:pStyle w:val="FirstParagraph"/>
       </w:pPr>
       <w:r>
-        <w:t xml:space="preserve">This template includes a GitHub Actions workflow that automatically builds and publishes your website to GitHub Pages when you push to the main branch.</w:t>
-      </w:r>
-    </w:p>
-    <w:p>
-      <w:pPr>
-        <w:pStyle w:val="BodyText"/>
-      </w:pPr>
-      <w:r>
-        <w:t xml:space="preserve">To enable GitHub Pages:</w:t>
-      </w:r>
-    </w:p>
-    <w:p>
-      <w:pPr>
-        <w:pStyle w:val="Compact"/>
-        <w:numPr>
-          <w:ilvl w:val="0"/>
-          <w:numId w:val="1003"/>
-        </w:numPr>
-      </w:pPr>
-      <w:r>
-        <w:t xml:space="preserve">Go to your repository settings</w:t>
-      </w:r>
-    </w:p>
-    <w:p>
-      <w:pPr>
-        <w:pStyle w:val="Compact"/>
-        <w:numPr>
-          <w:ilvl w:val="0"/>
-          <w:numId w:val="1003"/>
-        </w:numPr>
-      </w:pPr>
-      <w:r>
-        <w:t xml:space="preserve">Navigate to</w:t>
-      </w:r>
-      <w:r>
-        <w:t xml:space="preserve"> </w:t>
-      </w:r>
-      <w:r>
-        <w:t xml:space="preserve">“Pages”</w:t>
-      </w:r>
-      <w:r>
-        <w:t xml:space="preserve"> </w:t>
-      </w:r>
-      <w:r>
-        <w:t xml:space="preserve">in the left sidebar</w:t>
-      </w:r>
-    </w:p>
-    <w:p>
-      <w:pPr>
-        <w:pStyle w:val="Compact"/>
-        <w:numPr>
-          <w:ilvl w:val="0"/>
-          <w:numId w:val="1003"/>
-        </w:numPr>
-      </w:pPr>
-      <w:r>
-        <w:t xml:space="preserve">Under</w:t>
-      </w:r>
-      <w:r>
-        <w:t xml:space="preserve"> </w:t>
-      </w:r>
-      <w:r>
-        <w:t xml:space="preserve">“Build and deployment”</w:t>
-      </w:r>
-      <w:r>
-        <w:t xml:space="preserve">, set Source to</w:t>
-      </w:r>
-      <w:r>
-        <w:t xml:space="preserve"> </w:t>
-      </w:r>
-      <w:r>
-        <w:t xml:space="preserve">“GitHub Actions”</w:t>
-      </w:r>
-    </w:p>
-    <w:p>
-      <w:pPr>
-        <w:pStyle w:val="Compact"/>
-        <w:numPr>
-          <w:ilvl w:val="0"/>
-          <w:numId w:val="1003"/>
-        </w:numPr>
-      </w:pPr>
-      <w:r>
-        <w:t xml:space="preserve">Push your changes to the main branch</w:t>
-      </w:r>
-    </w:p>
-    <w:p>
-      <w:pPr>
-        <w:pStyle w:val="Compact"/>
-        <w:numPr>
-          <w:ilvl w:val="0"/>
-          <w:numId w:val="1003"/>
-        </w:numPr>
-      </w:pPr>
-      <w:r>
-        <w:t xml:space="preserve">The workflow will automatically build and deploy your website</w:t>
-      </w:r>
-    </w:p>
-    <w:p>
-      <w:pPr>
-        <w:pStyle w:val="FirstParagraph"/>
-      </w:pPr>
-      <w:r>
-        <w:t xml:space="preserve">Your website will be available at</w:t>
-      </w:r>
-      <w:r>
-        <w:t xml:space="preserve"> </w:t>
-      </w:r>
-      <w:r>
-        <w:rPr>
-          <w:rStyle w:val="VerbatimChar"/>
-        </w:rPr>
-        <w:t xml:space="preserve">https://YOUR-USERNAME.github.io/YOUR-REPO/</w:t>
-      </w:r>
-    </w:p>
-    <w:bookmarkEnd w:id="13"/>
-    <w:bookmarkStart w:id="14" w:name="license"/>
+        <w:t xml:space="preserve">See</w:t>
+      </w:r>
+      <w:r>
+        <w:t xml:space="preserve"> </w:t>
+      </w:r>
+      <w:hyperlink r:id="rId21">
+        <w:r>
+          <w:rPr>
+            <w:rStyle w:val="VerbatimChar"/>
+          </w:rPr>
+          <w:t xml:space="preserve">LICENSE</w:t>
+        </w:r>
+      </w:hyperlink>
+      <w:r>
+        <w:t xml:space="preserve">.</w:t>
+      </w:r>
+    </w:p>
+    <w:bookmarkEnd w:id="22"/>
+    <w:bookmarkStart w:id="24" w:name="references"/>
     <w:p>
       <w:pPr>
         <w:pStyle w:val="Heading2"/>
       </w:pPr>
       <w:r>
-        <w:t xml:space="preserve">0.5 License</w:t>
-      </w:r>
-    </w:p>
-    <w:p>
-      <w:pPr>
-        <w:pStyle w:val="FirstParagraph"/>
-      </w:pPr>
-      <w:r>
-        <w:t xml:space="preserve">Add your license information here.</w:t>
-      </w:r>
-    </w:p>
-    <w:bookmarkEnd w:id="14"/>
-    <w:bookmarkStart w:id="16" w:name="references"/>
-    <w:p>
-      <w:pPr>
-        <w:pStyle w:val="Heading2"/>
-      </w:pPr>
-      <w:r>
         <w:t xml:space="preserve">References</w:t>
       </w:r>
     </w:p>
-    <w:bookmarkStart w:id="15" w:name="refs"/>
-    <w:bookmarkEnd w:id="15"/>
-    <w:bookmarkEnd w:id="16"/>
-    <w:bookmarkEnd w:id="17"/>
+    <w:bookmarkStart w:id="23" w:name="refs"/>
+    <w:bookmarkEnd w:id="23"/>
+    <w:bookmarkEnd w:id="24"/>
     <w:sectPr>
       <w:footnotePr>
         <w:numRestart w:val="eachSect"/>
@@ -815,91 +885,6 @@
       </w:rPr>
     </w:lvl>
   </w:abstractNum>
-  <w:abstractNum w:abstractNumId="99411">
-    <w:nsid w:val="00A99411"/>
-    <w:multiLevelType w:val="multilevel"/>
-    <w:lvl w:ilvl="0">
-      <w:start w:val="1"/>
-      <w:numFmt w:val="decimal"/>
-      <w:lvlText w:val="%1."/>
-      <w:lvlJc w:val="left"/>
-      <w:pPr>
-        <w:ind w:left="720" w:hanging="360"/>
-      </w:pPr>
-    </w:lvl>
-    <w:lvl w:ilvl="1">
-      <w:start w:val="1"/>
-      <w:numFmt w:val="decimal"/>
-      <w:lvlText w:val="%2."/>
-      <w:lvlJc w:val="left"/>
-      <w:pPr>
-        <w:ind w:left="1440" w:hanging="360"/>
-      </w:pPr>
-    </w:lvl>
-    <w:lvl w:ilvl="2">
-      <w:start w:val="1"/>
-      <w:numFmt w:val="decimal"/>
-      <w:lvlText w:val="%3."/>
-      <w:lvlJc w:val="left"/>
-      <w:pPr>
-        <w:ind w:left="2160" w:hanging="360"/>
-      </w:pPr>
-    </w:lvl>
-    <w:lvl w:ilvl="3">
-      <w:start w:val="1"/>
-      <w:numFmt w:val="decimal"/>
-      <w:lvlText w:val="%4."/>
-      <w:lvlJc w:val="left"/>
-      <w:pPr>
-        <w:ind w:left="2880" w:hanging="360"/>
-      </w:pPr>
-    </w:lvl>
-    <w:lvl w:ilvl="4">
-      <w:start w:val="1"/>
-      <w:numFmt w:val="decimal"/>
-      <w:lvlText w:val="%5."/>
-      <w:lvlJc w:val="left"/>
-      <w:pPr>
-        <w:ind w:left="3600" w:hanging="360"/>
-      </w:pPr>
-    </w:lvl>
-    <w:lvl w:ilvl="5">
-      <w:start w:val="1"/>
-      <w:numFmt w:val="decimal"/>
-      <w:lvlText w:val="%6."/>
-      <w:lvlJc w:val="left"/>
-      <w:pPr>
-        <w:ind w:left="4320" w:hanging="360"/>
-      </w:pPr>
-    </w:lvl>
-    <w:lvl w:ilvl="6">
-      <w:start w:val="1"/>
-      <w:numFmt w:val="decimal"/>
-      <w:lvlText w:val="%7."/>
-      <w:lvlJc w:val="left"/>
-      <w:pPr>
-        <w:ind w:left="5040" w:hanging="360"/>
-      </w:pPr>
-    </w:lvl>
-    <w:lvl w:ilvl="7">
-      <w:start w:val="1"/>
-      <w:numFmt w:val="decimal"/>
-      <w:lvlText w:val="%8."/>
-      <w:lvlJc w:val="left"/>
-      <w:pPr>
-        <w:ind w:left="5760" w:hanging="360"/>
-      </w:pPr>
-    </w:lvl>
-    <w:lvl w:ilvl="8">
-      <w:start w:val="1"/>
-      <w:numFmt w:val="decimal"/>
-      <w:lvlText w:val="%9."/>
-      <w:lvlJc w:val="left"/>
-      <w:pPr>
-        <w:ind w:left="6480" w:hanging="360"/>
-      </w:pPr>
-    </w:lvl>
-  </w:abstractNum>
   <w:num w:numId="1000">
     <w:abstractNumId w:val="990"/>
   </w:num>
@@ -907,64 +892,7 @@
     <w:abstractNumId w:val="991"/>
   </w:num>
   <w:num w:numId="1002">
-    <w:abstractNumId w:val="99411"/>
-    <w:lvlOverride w:ilvl="0">
-      <w:startOverride w:val="1"/>
-    </w:lvlOverride>
-    <w:lvlOverride w:ilvl="1">
-      <w:startOverride w:val="1"/>
-    </w:lvlOverride>
-    <w:lvlOverride w:ilvl="2">
-      <w:startOverride w:val="1"/>
-    </w:lvlOverride>
-    <w:lvlOverride w:ilvl="3">
-      <w:startOverride w:val="1"/>
-    </w:lvlOverride>
-    <w:lvlOverride w:ilvl="4">
-      <w:startOverride w:val="1"/>
-    </w:lvlOverride>
-    <w:lvlOverride w:ilvl="5">
-      <w:startOverride w:val="1"/>
-    </w:lvlOverride>
-    <w:lvlOverride w:ilvl="6">
-      <w:startOverride w:val="1"/>
-    </w:lvlOverride>
-    <w:lvlOverride w:ilvl="7">
-      <w:startOverride w:val="1"/>
-    </w:lvlOverride>
-    <w:lvlOverride w:ilvl="8">
-      <w:startOverride w:val="1"/>
-    </w:lvlOverride>
-  </w:num>
-  <w:num w:numId="1003">
-    <w:abstractNumId w:val="99411"/>
-    <w:lvlOverride w:ilvl="0">
-      <w:startOverride w:val="1"/>
-    </w:lvlOverride>
-    <w:lvlOverride w:ilvl="1">
-      <w:startOverride w:val="1"/>
-    </w:lvlOverride>
-    <w:lvlOverride w:ilvl="2">
-      <w:startOverride w:val="1"/>
-    </w:lvlOverride>
-    <w:lvlOverride w:ilvl="3">
-      <w:startOverride w:val="1"/>
-    </w:lvlOverride>
-    <w:lvlOverride w:ilvl="4">
-      <w:startOverride w:val="1"/>
-    </w:lvlOverride>
-    <w:lvlOverride w:ilvl="5">
-      <w:startOverride w:val="1"/>
-    </w:lvlOverride>
-    <w:lvlOverride w:ilvl="6">
-      <w:startOverride w:val="1"/>
-    </w:lvlOverride>
-    <w:lvlOverride w:ilvl="7">
-      <w:startOverride w:val="1"/>
-    </w:lvlOverride>
-    <w:lvlOverride w:ilvl="8">
-      <w:startOverride w:val="1"/>
-    </w:lvlOverride>
+    <w:abstractNumId w:val="991"/>
   </w:num>
 </w:numbering>
 </file>

</xml_diff>